<commit_message>
docs: udpate backend url
</commit_message>
<xml_diff>
--- a/docs/report.docx
+++ b/docs/report.docx
@@ -160,13 +160,7 @@
               <w:rPr>
                 <w:sz w:val="20"/>
               </w:rPr>
-              <w:t xml:space="preserve">Industrial Intelligence / Worker Safety / </w:t>
-            </w:r>
-            <w:r>
-              <w:rPr>
-                <w:sz w:val="20"/>
-              </w:rPr>
-              <w:t>Geospatial Safety Analytics</w:t>
+              <w:t>Industrial Intelligence / Worker Safety / Geospatial Safety Analytics</w:t>
             </w:r>
           </w:p>
         </w:tc>
@@ -311,7 +305,15 @@
                 <w:sz w:val="20"/>
                 <w:u w:val="single"/>
               </w:rPr>
-              <w:t>https://fusioniq-backend.onrender.com/docs</w:t>
+              <w:t>https://fusioniq-backend-vrwf.onrender.com</w:t>
+            </w:r>
+            <w:r>
+              <w:rPr>
+                <w:color w:val="2563EB"/>
+                <w:sz w:val="20"/>
+                <w:u w:val="single"/>
+              </w:rPr>
+              <w:t>/docs</w:t>
             </w:r>
           </w:p>
         </w:tc>
@@ -334,16 +336,7 @@
           <w:color w:val="0F172A"/>
           <w:sz w:val="36"/>
         </w:rPr>
-        <w:t xml:space="preserve">1. </w:t>
-      </w:r>
-      <w:r>
-        <w:rPr>
-          <w:rFonts w:ascii="Arial" w:hAnsi="Arial"/>
-          <w:b/>
-          <w:color w:val="0F172A"/>
-          <w:sz w:val="36"/>
-        </w:rPr>
-        <w:t>Executive Summary &amp; Problem Context</w:t>
+        <w:t>1. Executive Summary &amp; Problem Context</w:t>
       </w:r>
     </w:p>
     <w:p>
@@ -366,13 +359,7 @@
         <w:spacing w:after="120"/>
       </w:pPr>
       <w:r>
-        <w:t xml:space="preserve">According to official DGFASLI statistics, India's heavy industrial sector experiences over 6,500 fatal workplace accidents annually (excluding most unorganized mining and construction sectors). In </w:t>
-      </w:r>
-      <w:r>
-        <w:t>January 2025, eight workers tragically lost their lives at the Visakhapatnam Steel Plant due to a toxic gas explosion in a coke oven battery. Investigation records revealed that functioning safety systems (gas detectors, permits-to-work, SCADA) were presen</w:t>
-      </w:r>
-      <w:r>
-        <w:t>t, and gas sensors had logged elevated pressure warnings—yet no unified intelligence layer connected these separate readings to operational decisions in time.</w:t>
+        <w:t>According to official DGFASLI statistics, India's heavy industrial sector experiences over 6,500 fatal workplace accidents annually (excluding most unorganized mining and construction sectors). In January 2025, eight workers tragically lost their lives at the Visakhapatnam Steel Plant due to a toxic gas explosion in a coke oven battery. Investigation records revealed that functioning safety systems (gas detectors, permits-to-work, SCADA) were present, and gas sensors had logged elevated pressure warnings—yet no unified intelligence layer connected these separate readings to operational decisions in time.</w:t>
       </w:r>
     </w:p>
     <w:p>
@@ -380,10 +367,7 @@
         <w:spacing w:after="120"/>
       </w:pPr>
       <w:r>
-        <w:t>A 2024 FICCI survey of over 600 large industrial facilities revealed that 60%+ of facilities rely</w:t>
-      </w:r>
-      <w:r>
-        <w:t xml:space="preserve"> on fragmented, manual handoffs to coordinate safety tools, worker telemetry, and permit approvals. Data is present, but unacted upon.</w:t>
+        <w:t>A 2024 FICCI survey of over 600 large industrial facilities revealed that 60%+ of facilities rely on fragmented, manual handoffs to coordinate safety tools, worker telemetry, and permit approvals. Data is present, but unacted upon.</w:t>
       </w:r>
     </w:p>
     <w:p>
@@ -406,10 +390,7 @@
         <w:spacing w:after="120"/>
       </w:pPr>
       <w:r>
-        <w:t>Traditional SCADA systems monitor isolated sensors and alert only when an individual reading breach</w:t>
-      </w:r>
-      <w:r>
-        <w:t>es a hardcoded limit. However, industrial disasters rarely result from a single failure; they are triggered by compound risk factors that are individually 'sub-alarm' or 'safe', but collectively catastrophic:</w:t>
+        <w:t>Traditional SCADA systems monitor isolated sensors and alert only when an individual reading breaches a hardcoded limit. However, industrial disasters rarely result from a single failure; they are triggered by compound risk factors that are individually 'sub-alarm' or 'safe', but collectively catastrophic:</w:t>
       </w:r>
     </w:p>
     <w:p>
@@ -418,10 +399,7 @@
         <w:spacing w:after="80"/>
       </w:pPr>
       <w:r>
-        <w:t>Gas concentration at 85 PPM (Safe on its own; h</w:t>
-      </w:r>
-      <w:r>
-        <w:t>ard alarm threshold is 100 PPM).</w:t>
+        <w:t>Gas concentration at 85 PPM (Safe on its own; hard alarm threshold is 100 PPM).</w:t>
       </w:r>
     </w:p>
     <w:p>
@@ -449,10 +427,7 @@
       </w:pPr>
       <w:r>
         <w:lastRenderedPageBreak/>
-        <w:t>Active Maintenance Team (Additional ignitio</w:t>
-      </w:r>
-      <w:r>
-        <w:t>n sources and operational complexity).</w:t>
+        <w:t>Active Maintenance Team (Additional ignition sources and operational complexity).</w:t>
       </w:r>
     </w:p>
     <w:tbl>
@@ -507,14 +482,7 @@
                 <w:i/>
                 <w:sz w:val="21"/>
               </w:rPr>
-              <w:t>Individually, these four indicators trigger zero SCADA alarms. Together, they create a ticking time bomb. FusionIQ integrates disparate data streams into a unified predictive hazard engine that ev</w:t>
-            </w:r>
-            <w:r>
-              <w:rPr>
-                <w:i/>
-                <w:sz w:val="21"/>
-              </w:rPr>
-              <w:t>aluates facility compound risk, explains threats in natural language via AI, matches historical incident patterns, and automates emergency compliance protocols.</w:t>
+              <w:t>Individually, these four indicators trigger zero SCADA alarms. Together, they create a ticking time bomb. FusionIQ integrates disparate data streams into a unified predictive hazard engine that evaluates facility compound risk, explains threats in natural language via AI, matches historical incident patterns, and automates emergency compliance protocols.</w:t>
             </w:r>
           </w:p>
         </w:tc>
@@ -545,10 +513,7 @@
         <w:spacing w:after="120"/>
       </w:pPr>
       <w:r>
-        <w:t>The central innovation of Fusion</w:t>
-      </w:r>
-      <w:r>
-        <w:t>IQ lies in backend/app/hazard_engine.py, which bypasses naive isolated thresholds to evaluate super-linear compound risk interaction across 4 specialized signal agents.</w:t>
+        <w:t>The central innovation of FusionIQ lies in backend/app/hazard_engine.py, which bypasses naive isolated thresholds to evaluate super-linear compound risk interaction across 4 specialized signal agents.</w:t>
       </w:r>
     </w:p>
     <w:p>
@@ -600,15 +565,7 @@
                 <w:color w:val="E2E8F0"/>
                 <w:sz w:val="19"/>
               </w:rPr>
-              <w:t># 1. Independent Partial Risk Scores from 4 Signal Agent</w:t>
-            </w:r>
-            <w:r>
-              <w:rPr>
-                <w:rFonts w:ascii="Consolas" w:hAnsi="Consolas"/>
-                <w:color w:val="E2E8F0"/>
-                <w:sz w:val="19"/>
-              </w:rPr>
-              <w:t>s</w:t>
+              <w:t># 1. Independent Partial Risk Scores from 4 Signal Agents</w:t>
             </w:r>
             <w:r>
               <w:rPr>
@@ -635,15 +592,7 @@
                 <w:sz w:val="19"/>
               </w:rPr>
               <w:br/>
-              <w:t>worker_score       = 15.0 if confined_space_entry</w:t>
-            </w:r>
-            <w:r>
-              <w:rPr>
-                <w:rFonts w:ascii="Consolas" w:hAnsi="Consolas"/>
-                <w:color w:val="E2E8F0"/>
-                <w:sz w:val="19"/>
-              </w:rPr>
-              <w:t xml:space="preserve"> else 0.0          # Trapped worker / escape bottleneck</w:t>
+              <w:t>worker_score       = 15.0 if confined_space_entry else 0.0          # Trapped worker / escape bottleneck</w:t>
             </w:r>
             <w:r>
               <w:rPr>
@@ -686,15 +635,7 @@
                 <w:sz w:val="19"/>
               </w:rPr>
               <w:br/>
-              <w:t># 2. Non-Linear Compound Int</w:t>
-            </w:r>
-            <w:r>
-              <w:rPr>
-                <w:rFonts w:ascii="Consolas" w:hAnsi="Consolas"/>
-                <w:color w:val="E2E8F0"/>
-                <w:sz w:val="19"/>
-              </w:rPr>
-              <w:t>eraction Bonus</w:t>
+              <w:t># 2. Non-Linear Compound Interaction Bonus</w:t>
             </w:r>
             <w:r>
               <w:rPr>
@@ -729,15 +670,7 @@
                 <w:sz w:val="19"/>
               </w:rPr>
               <w:br/>
-              <w:t>if (gas_ppm / gas_threshold) &gt; 0.75 and active_operational_factors &gt;= 2</w:t>
-            </w:r>
-            <w:r>
-              <w:rPr>
-                <w:rFonts w:ascii="Consolas" w:hAnsi="Consolas"/>
-                <w:color w:val="E2E8F0"/>
-                <w:sz w:val="19"/>
-              </w:rPr>
-              <w:t>:</w:t>
+              <w:t>if (gas_ppm / gas_threshold) &gt; 0.75 and active_operational_factors &gt;= 2:</w:t>
             </w:r>
             <w:r>
               <w:rPr>
@@ -1068,10 +1001,7 @@
           </w:tcPr>
           <w:p>
             <w:r>
-              <w:t xml:space="preserve">High risk threshold breached. </w:t>
-            </w:r>
-            <w:r>
-              <w:t>Hot-work reviews &amp; worker warnings initiated.</w:t>
+              <w:t>High risk threshold breached. Hot-work reviews &amp; worker warnings initiated.</w:t>
             </w:r>
           </w:p>
         </w:tc>
@@ -1157,10 +1087,7 @@
         <w:spacing w:after="120"/>
       </w:pPr>
       <w:r>
-        <w:t xml:space="preserve">Consider an operational scenario in Zone </w:t>
-      </w:r>
-      <w:r>
-        <w:t>Alpha (Compressor Hall):</w:t>
+        <w:t>Consider an operational scenario in Zone Alpha (Compressor Hall):</w:t>
       </w:r>
       <w:r>
         <w:br/>
@@ -1183,10 +1110,7 @@
       </w:r>
       <w:r>
         <w:br/>
-        <w:t>• Gas Agent S</w:t>
-      </w:r>
-      <w:r>
-        <w:t>core: 54.6 pts</w:t>
+        <w:t>• Gas Agent Score: 54.6 pts</w:t>
       </w:r>
       <w:r>
         <w:br/>
@@ -1206,10 +1130,7 @@
       </w:r>
       <w:r>
         <w:br/>
-        <w:t>• Final Compound Score: 100.0 (Critical) [Clampe</w:t>
-      </w:r>
-      <w:r>
-        <w:t>d]</w:t>
+        <w:t>• Final Compound Score: 100.0 (Critical) [Clamped]</w:t>
       </w:r>
       <w:r>
         <w:br/>
@@ -1240,10 +1161,7 @@
         <w:spacing w:after="120"/>
       </w:pPr>
       <w:r>
-        <w:t>FusionIQ utilizes a decoupled, a</w:t>
-      </w:r>
-      <w:r>
-        <w:t>synchronous multi-agent architecture to process high-frequency data streams, evaluate risk models, generate natural-language explanations, and present interactive UI visualizers.</w:t>
+        <w:t>FusionIQ utilizes a decoupled, asynchronous multi-agent architecture to process high-frequency data streams, evaluate risk models, generate natural-language explanations, and present interactive UI visualizers.</w:t>
       </w:r>
     </w:p>
     <w:tbl>
@@ -1280,15 +1198,7 @@
                 <w:color w:val="E2E8F0"/>
                 <w:sz w:val="19"/>
               </w:rPr>
-              <w:t xml:space="preserve"> Data Streams          Hazard Intelligence           Cognitive &amp; RAG         </w:t>
-            </w:r>
-            <w:r>
-              <w:rPr>
-                <w:rFonts w:ascii="Consolas" w:hAnsi="Consolas"/>
-                <w:color w:val="E2E8F0"/>
-                <w:sz w:val="19"/>
-              </w:rPr>
-              <w:t xml:space="preserve">  UI Dashboard</w:t>
+              <w:t xml:space="preserve"> Data Streams          Hazard Intelligence           Cognitive &amp; RAG           UI Dashboard</w:t>
             </w:r>
             <w:r>
               <w:rPr>
@@ -1315,15 +1225,7 @@
                 <w:sz w:val="19"/>
               </w:rPr>
               <w:br/>
-              <w:t xml:space="preserve"> [Permits] ────────►   (hazard_engine.py)           </w:t>
-            </w:r>
-            <w:r>
-              <w:rPr>
-                <w:rFonts w:ascii="Consolas" w:hAnsi="Consolas"/>
-                <w:color w:val="E2E8F0"/>
-                <w:sz w:val="19"/>
-              </w:rPr>
-              <w:t xml:space="preserve">  (explainability.py)     (HeatmapGrid.jsx)</w:t>
+              <w:t xml:space="preserve"> [Permits] ────────►   (hazard_engine.py)             (explainability.py)     (HeatmapGrid.jsx)</w:t>
             </w:r>
             <w:r>
               <w:rPr>
@@ -1350,15 +1252,7 @@
                 <w:sz w:val="19"/>
               </w:rPr>
               <w:br/>
-              <w:t xml:space="preserve">                 </w:t>
-            </w:r>
-            <w:r>
-              <w:rPr>
-                <w:rFonts w:ascii="Consolas" w:hAnsi="Consolas"/>
-                <w:color w:val="E2E8F0"/>
-                <w:sz w:val="19"/>
-              </w:rPr>
-              <w:t xml:space="preserve">     ├── worker_agent                [Compliance Audit] ───► [7-Section Report]</w:t>
+              <w:t xml:space="preserve">                      ├── worker_agent                [Compliance Audit] ───► [7-Section Report]</w:t>
             </w:r>
             <w:r>
               <w:rPr>
@@ -1400,8 +1294,22 @@
           <w:color w:val="2563EB"/>
           <w:sz w:val="28"/>
         </w:rPr>
-        <w:t xml:space="preserve">1. Asynchronous REST API </w:t>
+        <w:t>1. Asynchronous REST API Backend (main.py)</w:t>
       </w:r>
+    </w:p>
+    <w:p>
+      <w:pPr>
+        <w:spacing w:after="120"/>
+      </w:pPr>
+      <w:r>
+        <w:t>Built on Python 3.11 and FastAPI v0.8.0, the backend exposes 10 REST endpoints. It handles cross-origin resource sharing (CORS), asynchronous context management, and ORM database binding.</w:t>
+      </w:r>
+    </w:p>
+    <w:p>
+      <w:pPr>
+        <w:keepNext/>
+        <w:spacing w:before="280" w:after="120"/>
+      </w:pPr>
       <w:r>
         <w:rPr>
           <w:rFonts w:ascii="Arial" w:hAnsi="Arial"/>
@@ -1409,7 +1317,7 @@
           <w:color w:val="2563EB"/>
           <w:sz w:val="28"/>
         </w:rPr>
-        <w:t>Backend (main.py)</w:t>
+        <w:t>2. Real-Time Telemetry Data Simulator (simulator.py)</w:t>
       </w:r>
     </w:p>
     <w:p>
@@ -1417,7 +1325,7 @@
         <w:spacing w:after="120"/>
       </w:pPr>
       <w:r>
-        <w:t>Built on Python 3.11 and FastAPI v0.8.0, the backend exposes 10 REST endpoints. It handles cross-origin resource sharing (CORS), asynchronous context management, and ORM database binding.</w:t>
+        <w:t>Simulates a live industrial environment using scenario keyframes from data/scenario.json. The simulator linear-interpolates gas PPM between timestamps, injects ±2 PPM random noise, and controls start/pause/reset scenario clocks.</w:t>
       </w:r>
     </w:p>
     <w:p>
@@ -1432,16 +1340,7 @@
           <w:color w:val="2563EB"/>
           <w:sz w:val="28"/>
         </w:rPr>
-        <w:t>2. Real-Time Telemetry Data Simulator (simulator.p</w:t>
-      </w:r>
-      <w:r>
-        <w:rPr>
-          <w:rFonts w:ascii="Arial" w:hAnsi="Arial"/>
-          <w:b/>
-          <w:color w:val="2563EB"/>
-          <w:sz w:val="28"/>
-        </w:rPr>
-        <w:t>y)</w:t>
+        <w:t>3. Gemini-Powered AI Explainability (explainability.py)</w:t>
       </w:r>
     </w:p>
     <w:p>
@@ -1449,42 +1348,7 @@
         <w:spacing w:after="120"/>
       </w:pPr>
       <w:r>
-        <w:t>Simulates a live industrial environment using scenario keyframes from data/scenario.json. The simulator linear-interpolates gas PPM between timestamps, injects ±2 PPM random noise, and controls start/pause/reset scenario clocks.</w:t>
-      </w:r>
-    </w:p>
-    <w:p>
-      <w:pPr>
-        <w:keepNext/>
-        <w:spacing w:before="280" w:after="120"/>
-      </w:pPr>
-      <w:r>
-        <w:rPr>
-          <w:rFonts w:ascii="Arial" w:hAnsi="Arial"/>
-          <w:b/>
-          <w:color w:val="2563EB"/>
-          <w:sz w:val="28"/>
-        </w:rPr>
-        <w:t>3. Gemini-Powered AI Exp</w:t>
-      </w:r>
-      <w:r>
-        <w:rPr>
-          <w:rFonts w:ascii="Arial" w:hAnsi="Arial"/>
-          <w:b/>
-          <w:color w:val="2563EB"/>
-          <w:sz w:val="28"/>
-        </w:rPr>
-        <w:t>lainability (explainability.py)</w:t>
-      </w:r>
-    </w:p>
-    <w:p>
-      <w:pPr>
-        <w:spacing w:after="120"/>
-      </w:pPr>
-      <w:r>
-        <w:t>Integrates Google Gemini 2.0 Flash to evaluate real-time signals and return structured JSON containing root causes, AI confidence metrics, and three prioritized emergency steps. Features daemon threading with 5-second execut</w:t>
-      </w:r>
-      <w:r>
-        <w:t>ion timeouts and in-memory event-id caching to avoid redundant API consumption during 2-second UI polling.</w:t>
+        <w:t>Integrates Google Gemini 2.0 Flash to evaluate real-time signals and return structured JSON containing root causes, AI confidence metrics, and three prioritized emergency steps. Features daemon threading with 5-second execution timeouts and in-memory event-id caching to avoid redundant API consumption during 2-second UI polling.</w:t>
       </w:r>
     </w:p>
     <w:p>
@@ -1508,10 +1372,7 @@
         <w:spacing w:after="120"/>
       </w:pPr>
       <w:r>
-        <w:t>Extracts dynamic hazard tags (gas, hot_work, confined_space, maintenance) from telemetry and executes</w:t>
-      </w:r>
-      <w:r>
-        <w:t xml:space="preserve"> a tag-overlap search against a 15-entry historical incident corpus (data/incidents.json). Provides instant historical context and root-cause matching.</w:t>
+        <w:t>Extracts dynamic hazard tags (gas, hot_work, confined_space, maintenance) from telemetry and executes a tag-overlap search against a 15-entry historical incident corpus (data/incidents.json). Provides instant historical context and root-cause matching.</w:t>
       </w:r>
     </w:p>
     <w:p>
@@ -1534,10 +1395,7 @@
         <w:spacing w:after="120"/>
       </w:pPr>
       <w:r>
-        <w:t>Compiles structured 7-section comp</w:t>
-      </w:r>
-      <w:r>
-        <w:t>liance audit reports covering immediate actions, root cause analyses, follow-up steps, and statutory references under Section 36/36A of The Factories Act 1948, OISD Standards 105/116/117, and DGMS Circular 04/2023.</w:t>
+        <w:t>Compiles structured 7-section compliance audit reports covering immediate actions, root cause analyses, follow-up steps, and statutory references under Section 36/36A of The Factories Act 1948, OISD Standards 105/116/117, and DGMS Circular 04/2023.</w:t>
       </w:r>
     </w:p>
     <w:p>
@@ -1552,16 +1410,7 @@
           <w:color w:val="2563EB"/>
           <w:sz w:val="28"/>
         </w:rPr>
-        <w:t>6. Real-Time React Dashboard (App.jsx &amp; C</w:t>
-      </w:r>
-      <w:r>
-        <w:rPr>
-          <w:rFonts w:ascii="Arial" w:hAnsi="Arial"/>
-          <w:b/>
-          <w:color w:val="2563EB"/>
-          <w:sz w:val="28"/>
-        </w:rPr>
-        <w:t>omponents)</w:t>
+        <w:t>6. Real-Time React Dashboard (App.jsx &amp; Components)</w:t>
       </w:r>
     </w:p>
     <w:p>
@@ -1569,10 +1418,7 @@
         <w:spacing w:after="120"/>
       </w:pPr>
       <w:r>
-        <w:t>Built with React 18, Vite, and Tailwind CSS. Features an interactive SVG Geospatial Heatmap (HeatmapGrid.jsx), an interactive React Flow Knowledge Graph (KnowledgeGraph.jsx), real-time SIMOPs permit conflict panels, worker location tracking, and</w:t>
-      </w:r>
-      <w:r>
-        <w:t xml:space="preserve"> modal report viewers.</w:t>
+        <w:t>Built with React 18, Vite, and Tailwind CSS. Features an interactive SVG Geospatial Heatmap (HeatmapGrid.jsx), an interactive React Flow Knowledge Graph (KnowledgeGraph.jsx), real-time SIMOPs permit conflict panels, worker location tracking, and modal report viewers.</w:t>
       </w:r>
     </w:p>
     <w:p>
@@ -2541,10 +2387,7 @@
           </w:tcPr>
           <w:p>
             <w:r>
-              <w:t xml:space="preserve">Safe — </w:t>
-            </w:r>
-            <w:r>
-              <w:t>Clock auto-resets back to baseline nominal state.</w:t>
+              <w:t>Safe — Clock auto-resets back to baseline nominal state.</w:t>
             </w:r>
           </w:p>
         </w:tc>
@@ -2741,10 +2584,7 @@
           </w:tcPr>
           <w:p>
             <w:r>
-              <w:t xml:space="preserve">SQLite + </w:t>
-            </w:r>
-            <w:r>
-              <w:t>SQLAlchemy</w:t>
+              <w:t>SQLite + SQLAlchemy</w:t>
             </w:r>
           </w:p>
         </w:tc>
@@ -2879,10 +2719,7 @@
           </w:tcPr>
           <w:p>
             <w:r>
-              <w:t xml:space="preserve">Natural-language root cause &amp; emergency action </w:t>
-            </w:r>
-            <w:r>
-              <w:t>generation</w:t>
+              <w:t>Natural-language root cause &amp; emergency action generation</w:t>
             </w:r>
           </w:p>
         </w:tc>
@@ -3059,10 +2896,7 @@
           </w:tcPr>
           <w:p>
             <w:r>
-              <w:t xml:space="preserve">Live geospatial risk </w:t>
-            </w:r>
-            <w:r>
-              <w:t>zone heatmap visualization</w:t>
+              <w:t>Live geospatial risk zone heatmap visualization</w:t>
             </w:r>
           </w:p>
         </w:tc>
@@ -3200,16 +3034,7 @@
           <w:sz w:val="36"/>
         </w:rPr>
         <w:lastRenderedPageBreak/>
-        <w:t xml:space="preserve">7. Automated Testing &amp; </w:t>
-      </w:r>
-      <w:r>
-        <w:rPr>
-          <w:rFonts w:ascii="Arial" w:hAnsi="Arial"/>
-          <w:b/>
-          <w:color w:val="0F172A"/>
-          <w:sz w:val="36"/>
-        </w:rPr>
-        <w:t>Production Roadmap</w:t>
+        <w:t>7. Automated Testing &amp; Production Roadmap</w:t>
       </w:r>
     </w:p>
     <w:p>
@@ -3232,10 +3057,7 @@
         <w:spacing w:after="120"/>
       </w:pPr>
       <w:r>
-        <w:t>The backend includes 21 pytest unit tests (backend/tests/test_hazard_engine.py) providing 100% test coverage for the scoring logic. Tests validate partial agent weights, compound interaction bonus thresholds, scor</w:t>
-      </w:r>
-      <w:r>
-        <w:t>e clamping (0-100), and event-driven database persistence.</w:t>
+        <w:t>The backend includes 21 pytest unit tests (backend/tests/test_hazard_engine.py) providing 100% test coverage for the scoring logic. Tests validate partial agent weights, compound interaction bonus thresholds, score clamping (0-100), and event-driven database persistence.</w:t>
       </w:r>
     </w:p>
     <w:p>
@@ -3282,10 +3104,7 @@
         <w:t xml:space="preserve">2. Computer Vision: </w:t>
       </w:r>
       <w:r>
-        <w:t>CCTV C</w:t>
-      </w:r>
-      <w:r>
-        <w:t>omputer Vision Agent: Incorporate real-time video feeds for automated PPE detection and worker counts.</w:t>
+        <w:t>CCTV Computer Vision Agent: Incorporate real-time video feeds for automated PPE detection and worker counts.</w:t>
       </w:r>
     </w:p>
     <w:p>
@@ -3314,14 +3133,7 @@
           <w:b/>
           <w:color w:val="0F172A"/>
         </w:rPr>
-        <w:t>4. Edge Co</w:t>
-      </w:r>
-      <w:r>
-        <w:rPr>
-          <w:b/>
-          <w:color w:val="0F172A"/>
-        </w:rPr>
-        <w:t xml:space="preserve">mputing: </w:t>
+        <w:t xml:space="preserve">4. Edge Computing: </w:t>
       </w:r>
       <w:r>
         <w:t>Edge Deployment: Run hazard engines on AWS IoT Greengrass for zero-latency local execution during network blackouts.</w:t>
@@ -3425,19 +3237,11 @@
           <w:lang w:val="en-IN"/>
         </w:rPr>
       </w:pPr>
-      <w:proofErr w:type="spellStart"/>
       <w:r>
         <w:rPr>
           <w:lang w:val="en-IN"/>
         </w:rPr>
-        <w:t>FusionIQ</w:t>
-      </w:r>
-      <w:proofErr w:type="spellEnd"/>
-      <w:r>
-        <w:rPr>
-          <w:lang w:val="en-IN"/>
-        </w:rPr>
-        <w:t xml:space="preserve"> has successfully developed a functional prototype that demonstrates the core concept of AI</w:t>
+        <w:t>FusionIQ has successfully developed a functional prototype that demonstrates the core concept of AI</w:t>
       </w:r>
       <w:r>
         <w:rPr>
@@ -3635,21 +3439,7 @@
           <w:lang w:val="en-IN"/>
         </w:rPr>
         <w:lastRenderedPageBreak/>
-        <w:t xml:space="preserve">At its current stage, </w:t>
-      </w:r>
-      <w:proofErr w:type="spellStart"/>
-      <w:r>
-        <w:rPr>
-          <w:lang w:val="en-IN"/>
-        </w:rPr>
-        <w:t>FusionIQ</w:t>
-      </w:r>
-      <w:proofErr w:type="spellEnd"/>
-      <w:r>
-        <w:rPr>
-          <w:lang w:val="en-IN"/>
-        </w:rPr>
-        <w:t xml:space="preserve"> serves as a working proof-of-concept that validates the effectiveness of compound hazard intelligence for industrial safety applications.</w:t>
+        <w:t>At its current stage, FusionIQ serves as a working proof-of-concept that validates the effectiveness of compound hazard intelligence for industrial safety applications.</w:t>
       </w:r>
     </w:p>
     <w:p>
@@ -3709,19 +3499,11 @@
           <w:lang w:val="en-IN"/>
         </w:rPr>
       </w:pPr>
-      <w:proofErr w:type="spellStart"/>
       <w:r>
         <w:rPr>
           <w:lang w:val="en-IN"/>
         </w:rPr>
-        <w:t>FusionIQ</w:t>
-      </w:r>
-      <w:proofErr w:type="spellEnd"/>
-      <w:r>
-        <w:rPr>
-          <w:lang w:val="en-IN"/>
-        </w:rPr>
-        <w:t xml:space="preserve"> is envisioned as a next-generation Industrial Safety Intelligence Platform capable of transforming traditional industrial monitoring into a fully autonomous AI-powered safety ecosystem. The long-term objective is to build a unified platform where every critical component of an industrial facility continuously contributes to a live digital representation of the plant.</w:t>
+        <w:t>FusionIQ is envisioned as a next-generation Industrial Safety Intelligence Platform capable of transforming traditional industrial monitoring into a fully autonomous AI-powered safety ecosystem. The long-term objective is to build a unified platform where every critical component of an industrial facility continuously contributes to a live digital representation of the plant.</w:t>
       </w:r>
     </w:p>
     <w:p>
@@ -4002,21 +3784,7 @@
         <w:rPr>
           <w:lang w:val="en-IN"/>
         </w:rPr>
-        <w:t xml:space="preserve">Each agent will continuously </w:t>
-      </w:r>
-      <w:proofErr w:type="spellStart"/>
-      <w:r>
-        <w:rPr>
-          <w:lang w:val="en-IN"/>
-        </w:rPr>
-        <w:t>analyze</w:t>
-      </w:r>
-      <w:proofErr w:type="spellEnd"/>
-      <w:r>
-        <w:rPr>
-          <w:lang w:val="en-IN"/>
-        </w:rPr>
-        <w:t xml:space="preserve"> live operational data and communicate its findings to a centralized safety intelligence engine.</w:t>
+        <w:t>Each agent will continuously analyze live operational data and communicate its findings to a centralized safety intelligence engine.</w:t>
       </w:r>
     </w:p>
     <w:p>
@@ -4102,18 +3870,8 @@
           <w:bCs/>
           <w:lang w:val="en-IN"/>
         </w:rPr>
-        <w:t xml:space="preserve">Phase 4 – Intelligent Command </w:t>
+        <w:t>Phase 4 – Intelligent Command Center</w:t>
       </w:r>
-      <w:proofErr w:type="spellStart"/>
-      <w:r>
-        <w:rPr>
-          <w:b/>
-          <w:bCs/>
-          <w:lang w:val="en-IN"/>
-        </w:rPr>
-        <w:t>Center</w:t>
-      </w:r>
-      <w:proofErr w:type="spellEnd"/>
     </w:p>
     <w:p>
       <w:pPr>
@@ -4377,21 +4135,7 @@
         <w:rPr>
           <w:lang w:val="en-IN"/>
         </w:rPr>
-        <w:t xml:space="preserve">Deploy </w:t>
-      </w:r>
-      <w:proofErr w:type="spellStart"/>
-      <w:r>
-        <w:rPr>
-          <w:lang w:val="en-IN"/>
-        </w:rPr>
-        <w:t>FusionIQ</w:t>
-      </w:r>
-      <w:proofErr w:type="spellEnd"/>
-      <w:r>
-        <w:rPr>
-          <w:lang w:val="en-IN"/>
-        </w:rPr>
-        <w:t xml:space="preserve"> on Edge AI devices within industrial facilities to enable local, low-latency decision making. In high-risk situations, the system will autonomously activate emergency sirens, issue evacuation alerts, notify emergency response teams, preserve sensor evidence, and continue monitoring until the hazard is resolved, even during network outages.</w:t>
+        <w:t>Deploy FusionIQ on Edge AI devices within industrial facilities to enable local, low-latency decision making. In high-risk situations, the system will autonomously activate emergency sirens, issue evacuation alerts, notify emergency response teams, preserve sensor evidence, and continue monitoring until the hazard is resolved, even during network outages.</w:t>
       </w:r>
     </w:p>
     <w:p>
@@ -4440,19 +4184,11 @@
           <w:lang w:val="en-IN"/>
         </w:rPr>
       </w:pPr>
-      <w:proofErr w:type="spellStart"/>
       <w:r>
         <w:rPr>
           <w:lang w:val="en-IN"/>
         </w:rPr>
-        <w:t>FusionIQ</w:t>
-      </w:r>
-      <w:proofErr w:type="spellEnd"/>
-      <w:r>
-        <w:rPr>
-          <w:lang w:val="en-IN"/>
-        </w:rPr>
-        <w:t xml:space="preserve"> aims to significantly reduce industrial accidents by providing predictive safety intelligence instead of reactive monitoring. Through the integration of digital twins, multi-agent AI systems, real-time industrial data, and Edge AI, the platform has the potential to improve worker safety, reduce emergency response time, strengthen regulatory compliance, and support the vision of </w:t>
+        <w:t xml:space="preserve">FusionIQ aims to significantly reduce industrial accidents by providing predictive safety intelligence instead of reactive monitoring. Through the integration of digital twins, multi-agent AI systems, real-time industrial data, and Edge AI, the platform has the potential to improve worker safety, reduce emergency response time, strengthen regulatory compliance, and support the vision of </w:t>
       </w:r>
       <w:r>
         <w:rPr>

</xml_diff>